<commit_message>
gateway: MCP management + skill routing + circuit breaker upgrade
</commit_message>
<xml_diff>
--- a/使用说明.docx
+++ b/使用说明.docx
@@ -38,8 +38,6 @@
           <w:lang w:val="en-US" w:eastAsia="zh-CN"/>
         </w:rPr>
       </w:pPr>
-      <w:bookmarkStart w:id="0" w:name="_GoBack"/>
-      <w:bookmarkEnd w:id="0"/>
       <w:r>
         <w:rPr>
           <w:rFonts w:hint="eastAsia"/>
@@ -152,6 +150,75 @@
                     <a:xfrm>
                       <a:off x="0" y="0"/>
                       <a:ext cx="5262880" cy="3614420"/>
+                    </a:xfrm>
+                    <a:prstGeom prst="rect">
+                      <a:avLst/>
+                    </a:prstGeom>
+                    <a:noFill/>
+                    <a:ln>
+                      <a:noFill/>
+                    </a:ln>
+                  </pic:spPr>
+                </pic:pic>
+              </a:graphicData>
+            </a:graphic>
+          </wp:inline>
+        </w:drawing>
+      </w:r>
+    </w:p>
+    <w:p/>
+    <w:p>
+      <w:pPr>
+        <w:rPr>
+          <w:rFonts w:hint="default"/>
+          <w:lang w:val="en-US" w:eastAsia="zh-CN"/>
+        </w:rPr>
+      </w:pPr>
+      <w:r>
+        <w:rPr>
+          <w:rFonts w:hint="eastAsia"/>
+          <w:lang w:val="en-US" w:eastAsia="zh-CN"/>
+        </w:rPr>
+        <w:t>解压后，由于SKILL在用户目录里，所以需要你从clawhub里下载SKILL，才能正常使用banana生图功能。在技能管理页面，点击CLAWHUB，搜索banana，找到windows版本，安装即可。</w:t>
+      </w:r>
+      <w:bookmarkStart w:id="0" w:name="_GoBack"/>
+      <w:bookmarkEnd w:id="0"/>
+    </w:p>
+    <w:p>
+      <w:pPr>
+        <w:rPr>
+          <w:rFonts w:hint="default" w:eastAsiaTheme="minorEastAsia"/>
+          <w:lang w:val="en-US" w:eastAsia="zh-CN"/>
+        </w:rPr>
+      </w:pPr>
+      <w:r>
+        <w:drawing>
+          <wp:inline distT="0" distB="0" distL="114300" distR="114300">
+            <wp:extent cx="5257165" cy="2397125"/>
+            <wp:effectExtent l="0" t="0" r="1270" b="5080"/>
+            <wp:docPr id="3" name="图片 1"/>
+            <wp:cNvGraphicFramePr>
+              <a:graphicFrameLocks xmlns:a="http://schemas.openxmlformats.org/drawingml/2006/main" noChangeAspect="1"/>
+            </wp:cNvGraphicFramePr>
+            <a:graphic xmlns:a="http://schemas.openxmlformats.org/drawingml/2006/main">
+              <a:graphicData uri="http://schemas.openxmlformats.org/drawingml/2006/picture">
+                <pic:pic xmlns:pic="http://schemas.openxmlformats.org/drawingml/2006/picture">
+                  <pic:nvPicPr>
+                    <pic:cNvPr id="3" name="图片 1"/>
+                    <pic:cNvPicPr>
+                      <a:picLocks noChangeAspect="1"/>
+                    </pic:cNvPicPr>
+                  </pic:nvPicPr>
+                  <pic:blipFill>
+                    <a:blip r:embed="rId6"/>
+                    <a:stretch>
+                      <a:fillRect/>
+                    </a:stretch>
+                  </pic:blipFill>
+                  <pic:spPr>
+                    <a:xfrm>
+                      <a:off x="0" y="0"/>
+                      <a:ext cx="5257165" cy="2397125"/>
                     </a:xfrm>
                     <a:prstGeom prst="rect">
                       <a:avLst/>

</xml_diff>

<commit_message>
agent: apply workspace updates
</commit_message>
<xml_diff>
--- a/使用说明.docx
+++ b/使用说明.docx
@@ -181,13 +181,11 @@
         </w:rPr>
         <w:t>解压后，由于SKILL在用户目录里，所以需要你从clawhub里下载SKILL，才能正常使用banana生图功能。在技能管理页面，点击CLAWHUB，搜索banana，找到windows版本，安装即可。</w:t>
       </w:r>
-      <w:bookmarkStart w:id="0" w:name="_GoBack"/>
-      <w:bookmarkEnd w:id="0"/>
     </w:p>
     <w:p>
       <w:pPr>
         <w:rPr>
-          <w:rFonts w:hint="default" w:eastAsiaTheme="minorEastAsia"/>
+          <w:rFonts w:hint="default"/>
           <w:lang w:val="en-US" w:eastAsia="zh-CN"/>
         </w:rPr>
       </w:pPr>
@@ -233,6 +231,111 @@
             </a:graphic>
           </wp:inline>
         </w:drawing>
+      </w:r>
+      <w:r>
+        <w:br w:type="textWrapping"/>
+      </w:r>
+      <w:r>
+        <w:br w:type="textWrapping"/>
+      </w:r>
+      <w:r>
+        <w:rPr>
+          <w:rFonts w:hint="eastAsia"/>
+          <w:lang w:val="en-US" w:eastAsia="zh-CN"/>
+        </w:rPr>
+        <w:t>如果找不到技能，可将文件夹里的技能nano-banana-image-t8解压并放到用户目录里即可。</w:t>
+      </w:r>
+    </w:p>
+    <w:p>
+      <w:pPr>
+        <w:rPr>
+          <w:rFonts w:hint="default" w:eastAsiaTheme="minorEastAsia"/>
+          <w:lang w:val="en-US" w:eastAsia="zh-CN"/>
+        </w:rPr>
+      </w:pPr>
+      <w:r>
+        <w:rPr>
+          <w:rFonts w:hint="eastAsia"/>
+          <w:lang w:val="en-US" w:eastAsia="zh-CN"/>
+        </w:rPr>
+        <w:t>C:\Users\Administrator\.whaleclaw\workspace\skills</w:t>
+      </w:r>
+    </w:p>
+    <w:p>
+      <w:bookmarkStart w:id="0" w:name="_GoBack"/>
+      <w:r>
+        <w:drawing>
+          <wp:inline distT="0" distB="0" distL="114300" distR="114300">
+            <wp:extent cx="5273675" cy="2199005"/>
+            <wp:effectExtent l="0" t="0" r="1270" b="5080"/>
+            <wp:docPr id="4" name="图片 1"/>
+            <wp:cNvGraphicFramePr>
+              <a:graphicFrameLocks xmlns:a="http://schemas.openxmlformats.org/drawingml/2006/main" noChangeAspect="1"/>
+            </wp:cNvGraphicFramePr>
+            <a:graphic xmlns:a="http://schemas.openxmlformats.org/drawingml/2006/main">
+              <a:graphicData uri="http://schemas.openxmlformats.org/drawingml/2006/picture">
+                <pic:pic xmlns:pic="http://schemas.openxmlformats.org/drawingml/2006/picture">
+                  <pic:nvPicPr>
+                    <pic:cNvPr id="4" name="图片 1"/>
+                    <pic:cNvPicPr>
+                      <a:picLocks noChangeAspect="1"/>
+                    </pic:cNvPicPr>
+                  </pic:nvPicPr>
+                  <pic:blipFill>
+                    <a:blip r:embed="rId7"/>
+                    <a:stretch>
+                      <a:fillRect/>
+                    </a:stretch>
+                  </pic:blipFill>
+                  <pic:spPr>
+                    <a:xfrm>
+                      <a:off x="0" y="0"/>
+                      <a:ext cx="5273675" cy="2199005"/>
+                    </a:xfrm>
+                    <a:prstGeom prst="rect">
+                      <a:avLst/>
+                    </a:prstGeom>
+                    <a:noFill/>
+                    <a:ln>
+                      <a:noFill/>
+                    </a:ln>
+                  </pic:spPr>
+                </pic:pic>
+              </a:graphicData>
+            </a:graphic>
+          </wp:inline>
+        </w:drawing>
+      </w:r>
+      <w:bookmarkEnd w:id="0"/>
+    </w:p>
+    <w:p/>
+    <w:p/>
+    <w:p>
+      <w:pPr>
+        <w:rPr>
+          <w:rFonts w:hint="default"/>
+          <w:b/>
+          <w:bCs/>
+          <w:lang w:val="en-US" w:eastAsia="zh-CN"/>
+        </w:rPr>
+      </w:pPr>
+      <w:r>
+        <w:rPr>
+          <w:rFonts w:hint="eastAsia"/>
+          <w:b/>
+          <w:bCs/>
+          <w:lang w:val="en-US" w:eastAsia="zh-CN"/>
+        </w:rPr>
+        <w:t>如果要启用MCP服务，请双击</w:t>
+      </w:r>
+      <w:r>
+        <w:rPr>
+          <w:rFonts w:hint="default"/>
+          <w:b/>
+          <w:bCs/>
+          <w:lang w:val="en-US" w:eastAsia="zh-CN"/>
+        </w:rPr>
+        <w:t>安装mcporter.bat</w:t>
       </w:r>
     </w:p>
     <w:sectPr>

</xml_diff>

<commit_message>
agent: enhance tools, skills, browser, cron and gateway
Made-with: Cursor
</commit_message>
<xml_diff>
--- a/使用说明.docx
+++ b/使用说明.docx
@@ -243,16 +243,10 @@
           <w:rFonts w:hint="eastAsia"/>
           <w:lang w:val="en-US" w:eastAsia="zh-CN"/>
         </w:rPr>
-        <w:t>如果找不到技能，可将文件夹里的技能nano-banana-image-t8解压并放到用户目录里即可。</w:t>
-      </w:r>
-    </w:p>
-    <w:p>
-      <w:pPr>
-        <w:rPr>
-          <w:rFonts w:hint="default" w:eastAsiaTheme="minorEastAsia"/>
-          <w:lang w:val="en-US" w:eastAsia="zh-CN"/>
-        </w:rPr>
-      </w:pPr>
+        <w:t>如果找不到技能，推荐将项目文件夹里的skills压缩包解压并整个放到用户目录里即可。</w:t>
+      </w:r>
+    </w:p>
+    <w:p>
       <w:r>
         <w:rPr>
           <w:rFonts w:hint="eastAsia"/>
@@ -260,14 +254,15 @@
         </w:rPr>
         <w:t>C:\Users\Administrator\.whaleclaw\workspace\skills</w:t>
       </w:r>
-    </w:p>
-    <w:p>
       <w:bookmarkStart w:id="0" w:name="_GoBack"/>
+      <w:bookmarkEnd w:id="0"/>
+    </w:p>
+    <w:p>
       <w:r>
         <w:drawing>
           <wp:inline distT="0" distB="0" distL="114300" distR="114300">
-            <wp:extent cx="5273675" cy="2199005"/>
-            <wp:effectExtent l="0" t="0" r="1270" b="5080"/>
+            <wp:extent cx="5260975" cy="2390775"/>
+            <wp:effectExtent l="0" t="0" r="5715" b="3175"/>
             <wp:docPr id="4" name="图片 1"/>
             <wp:cNvGraphicFramePr>
               <a:graphicFrameLocks xmlns:a="http://schemas.openxmlformats.org/drawingml/2006/main" noChangeAspect="1"/>
@@ -290,7 +285,7 @@
                   <pic:spPr>
                     <a:xfrm>
                       <a:off x="0" y="0"/>
-                      <a:ext cx="5273675" cy="2199005"/>
+                      <a:ext cx="5260975" cy="2390775"/>
                     </a:xfrm>
                     <a:prstGeom prst="rect">
                       <a:avLst/>
@@ -306,9 +301,7 @@
           </wp:inline>
         </w:drawing>
       </w:r>
-      <w:bookmarkEnd w:id="0"/>
-    </w:p>
-    <w:p/>
+    </w:p>
     <w:p/>
     <w:p>
       <w:pPr>

</xml_diff>